<commit_message>
apply changes to obscene materials convictions; fix review screen bug; move judgments and pending cases to statement of facts; minor changes
</commit_message>
<xml_diff>
--- a/docassemble/MLHPPOAndProposedOrder/data/templates/cc_375_attachment.docx
+++ b/docassemble/MLHPPOAndProposedOrder/data/templates/cc_375_attachment.docx
@@ -50,1136 +50,6 @@
           <w:rFonts w:ascii="Arial" w:hAnsi="Arial" w:cs="Arial"/>
         </w:rPr>
       </w:pPr>
-    </w:p>
-    <w:p>
-      <w:pPr>
-        <w:rPr>
-          <w:rFonts w:ascii="Arial" w:hAnsi="Arial" w:cs="Arial"/>
-          <w:sz w:val="22"/>
-          <w:szCs w:val="22"/>
-        </w:rPr>
-      </w:pPr>
-      <w:r>
-        <w:rPr>
-          <w:rFonts w:ascii="Arial" w:hAnsi="Arial" w:cs="Arial"/>
-          <w:sz w:val="22"/>
-          <w:szCs w:val="22"/>
-        </w:rPr>
-        <w:t xml:space="preserve">{%p if </w:t>
-      </w:r>
-      <w:r>
-        <w:rPr>
-          <w:rFonts w:ascii="Arial" w:hAnsi="Arial" w:cs="Arial"/>
-          <w:sz w:val="22"/>
-          <w:szCs w:val="22"/>
-        </w:rPr>
-        <w:t>pending_actions_between_parties_yes</w:t>
-      </w:r>
-      <w:r>
-        <w:rPr>
-          <w:rFonts w:ascii="Arial" w:hAnsi="Arial" w:cs="Arial"/>
-          <w:sz w:val="22"/>
-          <w:szCs w:val="22"/>
-        </w:rPr>
-        <w:t xml:space="preserve"> %}</w:t>
-      </w:r>
-    </w:p>
-    <w:p>
-      <w:pPr>
-        <w:rPr>
-          <w:rFonts w:ascii="Arial" w:hAnsi="Arial" w:cs="Arial"/>
-          <w:sz w:val="22"/>
-          <w:szCs w:val="22"/>
-        </w:rPr>
-      </w:pPr>
-      <w:r>
-        <w:rPr>
-          <w:rFonts w:ascii="Arial" w:hAnsi="Arial" w:cs="Arial"/>
-          <w:sz w:val="22"/>
-          <w:szCs w:val="22"/>
-        </w:rPr>
-        <w:t xml:space="preserve">Other Pending Actions, continued from </w:t>
-      </w:r>
-      <w:r>
-        <w:rPr>
-          <w:rFonts w:ascii="Arial" w:hAnsi="Arial" w:cs="Arial"/>
-          <w:color w:val="000000"/>
-          <w:sz w:val="22"/>
-          <w:szCs w:val="22"/>
-        </w:rPr>
-        <w:t>{% if respondent_is_minor and (not respondent_is_emancipated_minor) %}E4a{% else %}</w:t>
-      </w:r>
-      <w:r>
-        <w:rPr>
-          <w:rFonts w:ascii="Arial" w:hAnsi="Arial" w:cs="Arial"/>
-          <w:sz w:val="22"/>
-          <w:szCs w:val="22"/>
-        </w:rPr>
-        <w:t>D</w:t>
-      </w:r>
-      <w:r>
-        <w:rPr>
-          <w:rFonts w:ascii="Arial" w:hAnsi="Arial" w:cs="Arial"/>
-          <w:sz w:val="22"/>
-          <w:szCs w:val="22"/>
-        </w:rPr>
-        <w:t>3a</w:t>
-      </w:r>
-      <w:r>
-        <w:rPr>
-          <w:rFonts w:ascii="Arial" w:hAnsi="Arial" w:cs="Arial"/>
-          <w:sz w:val="22"/>
-          <w:szCs w:val="22"/>
-        </w:rPr>
-        <w:t>{% endif %}</w:t>
-      </w:r>
-    </w:p>
-    <w:p>
-      <w:pPr>
-        <w:rPr>
-          <w:rFonts w:ascii="Arial" w:hAnsi="Arial" w:cs="Arial"/>
-          <w:sz w:val="22"/>
-          <w:szCs w:val="22"/>
-        </w:rPr>
-      </w:pPr>
-      <w:r>
-        <w:rPr>
-          <w:rFonts w:ascii="Arial" w:hAnsi="Arial" w:cs="Arial"/>
-          <w:sz w:val="22"/>
-          <w:szCs w:val="22"/>
-        </w:rPr>
-        <w:tab/>
-        <w:t xml:space="preserve">{%p for action in </w:t>
-      </w:r>
-      <w:r>
-        <w:t>pending_actions.complete_elements()</w:t>
-      </w:r>
-      <w:r>
-        <w:rPr>
-          <w:rFonts w:ascii="Arial" w:hAnsi="Arial" w:cs="Arial"/>
-          <w:sz w:val="22"/>
-          <w:szCs w:val="22"/>
-        </w:rPr>
-        <w:t xml:space="preserve"> %}</w:t>
-      </w:r>
-    </w:p>
-    <w:p>
-      <w:pPr>
-        <w:rPr>
-          <w:rFonts w:ascii="Arial" w:hAnsi="Arial" w:cs="Arial"/>
-          <w:sz w:val="22"/>
-          <w:szCs w:val="22"/>
-        </w:rPr>
-      </w:pPr>
-    </w:p>
-    <w:p>
-      <w:pPr>
-        <w:rPr>
-          <w:rFonts w:ascii="Arial" w:hAnsi="Arial" w:cs="Arial"/>
-          <w:sz w:val="22"/>
-          <w:szCs w:val="22"/>
-        </w:rPr>
-      </w:pPr>
-      <w:r>
-        <w:rPr>
-          <w:rFonts w:ascii="Arial" w:hAnsi="Arial" w:cs="Arial"/>
-          <w:sz w:val="22"/>
-          <w:szCs w:val="22"/>
-        </w:rPr>
-        <w:tab/>
-        <w:t>Case number: {{ action.docket_number }}</w:t>
-      </w:r>
-    </w:p>
-    <w:p>
-      <w:pPr>
-        <w:rPr>
-          <w:rFonts w:ascii="Arial" w:hAnsi="Arial" w:cs="Arial"/>
-          <w:sz w:val="22"/>
-          <w:szCs w:val="22"/>
-        </w:rPr>
-      </w:pPr>
-      <w:r>
-        <w:rPr>
-          <w:rFonts w:ascii="Arial" w:hAnsi="Arial" w:cs="Arial"/>
-          <w:sz w:val="22"/>
-          <w:szCs w:val="22"/>
-        </w:rPr>
-        <w:tab/>
-        <w:t>{%p if action.court_name %}</w:t>
-      </w:r>
-    </w:p>
-    <w:p>
-      <w:pPr>
-        <w:ind w:left="720"/>
-        <w:rPr>
-          <w:rFonts w:ascii="Arial" w:hAnsi="Arial" w:cs="Arial"/>
-          <w:sz w:val="22"/>
-          <w:szCs w:val="22"/>
-        </w:rPr>
-      </w:pPr>
-      <w:r>
-        <w:rPr>
-          <w:rFonts w:ascii="Arial" w:hAnsi="Arial" w:cs="Arial"/>
-          <w:sz w:val="22"/>
-          <w:szCs w:val="22"/>
-        </w:rPr>
-        <w:t>Name of court: {{ action.court_name }</w:t>
-      </w:r>
-      <w:r>
-        <w:rPr>
-          <w:rFonts w:ascii="Arial" w:hAnsi="Arial" w:cs="Arial"/>
-          <w:sz w:val="22"/>
-          <w:szCs w:val="22"/>
-        </w:rPr>
-        <w:t>}</w:t>
-      </w:r>
-    </w:p>
-    <w:p>
-      <w:pPr>
-        <w:ind w:left="720"/>
-        <w:rPr>
-          <w:rFonts w:ascii="Arial" w:hAnsi="Arial" w:cs="Arial"/>
-          <w:sz w:val="22"/>
-          <w:szCs w:val="22"/>
-        </w:rPr>
-      </w:pPr>
-      <w:r>
-        <w:rPr>
-          <w:rFonts w:ascii="Arial" w:hAnsi="Arial" w:cs="Arial"/>
-          <w:sz w:val="22"/>
-          <w:szCs w:val="22"/>
-        </w:rPr>
-        <w:t>{%p else %}</w:t>
-      </w:r>
-    </w:p>
-    <w:p>
-      <w:pPr>
-        <w:ind w:left="720"/>
-        <w:rPr>
-          <w:rFonts w:ascii="Arial" w:hAnsi="Arial" w:cs="Arial"/>
-          <w:sz w:val="22"/>
-          <w:szCs w:val="22"/>
-        </w:rPr>
-      </w:pPr>
-      <w:r>
-        <w:rPr>
-          <w:rFonts w:ascii="Arial" w:hAnsi="Arial" w:cs="Arial"/>
-          <w:sz w:val="22"/>
-          <w:szCs w:val="22"/>
-        </w:rPr>
-        <w:t>Name of court:___________________________________________</w:t>
-      </w:r>
-      <w:r>
-        <w:rPr>
-          <w:rFonts w:ascii="Arial" w:hAnsi="Arial" w:cs="Arial"/>
-          <w:sz w:val="22"/>
-          <w:szCs w:val="22"/>
-        </w:rPr>
-        <w:t>_________</w:t>
-      </w:r>
-    </w:p>
-    <w:p>
-      <w:pPr>
-        <w:ind w:left="720"/>
-        <w:rPr>
-          <w:rFonts w:ascii="Arial" w:hAnsi="Arial" w:cs="Arial"/>
-          <w:sz w:val="22"/>
-          <w:szCs w:val="22"/>
-        </w:rPr>
-      </w:pPr>
-      <w:r>
-        <w:rPr>
-          <w:rFonts w:ascii="Arial" w:hAnsi="Arial" w:cs="Arial"/>
-          <w:sz w:val="22"/>
-          <w:szCs w:val="22"/>
-        </w:rPr>
-        <w:t>{%p endif %}</w:t>
-      </w:r>
-    </w:p>
-    <w:p>
-      <w:pPr>
-        <w:ind w:left="720"/>
-        <w:rPr>
-          <w:rFonts w:ascii="Arial" w:hAnsi="Arial" w:cs="Arial"/>
-          <w:sz w:val="22"/>
-          <w:szCs w:val="22"/>
-        </w:rPr>
-      </w:pPr>
-      <w:r>
-        <w:rPr>
-          <w:rFonts w:ascii="Arial" w:hAnsi="Arial" w:cs="Arial"/>
-          <w:sz w:val="22"/>
-          <w:szCs w:val="22"/>
-        </w:rPr>
-        <w:t>{%p if action.court_county %}</w:t>
-      </w:r>
-    </w:p>
-    <w:p>
-      <w:pPr>
-        <w:ind w:left="720"/>
-        <w:rPr>
-          <w:rFonts w:ascii="Arial" w:hAnsi="Arial" w:cs="Arial"/>
-          <w:sz w:val="22"/>
-          <w:szCs w:val="22"/>
-        </w:rPr>
-      </w:pPr>
-      <w:r>
-        <w:rPr>
-          <w:rFonts w:ascii="Arial" w:hAnsi="Arial" w:cs="Arial"/>
-          <w:sz w:val="22"/>
-          <w:szCs w:val="22"/>
-        </w:rPr>
-        <w:t>County: {{ action.court_county }}</w:t>
-      </w:r>
-    </w:p>
-    <w:p>
-      <w:pPr>
-        <w:ind w:left="720"/>
-        <w:rPr>
-          <w:rFonts w:ascii="Arial" w:hAnsi="Arial" w:cs="Arial"/>
-          <w:sz w:val="22"/>
-          <w:szCs w:val="22"/>
-        </w:rPr>
-      </w:pPr>
-      <w:r>
-        <w:rPr>
-          <w:rFonts w:ascii="Arial" w:hAnsi="Arial" w:cs="Arial"/>
-          <w:sz w:val="22"/>
-          <w:szCs w:val="22"/>
-        </w:rPr>
-        <w:t>{%p else %}</w:t>
-      </w:r>
-    </w:p>
-    <w:p>
-      <w:pPr>
-        <w:ind w:left="720"/>
-        <w:rPr>
-          <w:rFonts w:ascii="Arial" w:hAnsi="Arial" w:cs="Arial"/>
-          <w:sz w:val="22"/>
-          <w:szCs w:val="22"/>
-        </w:rPr>
-      </w:pPr>
-      <w:r>
-        <w:rPr>
-          <w:rFonts w:ascii="Arial" w:hAnsi="Arial" w:cs="Arial"/>
-          <w:sz w:val="22"/>
-          <w:szCs w:val="22"/>
-        </w:rPr>
-        <w:t>County:__________________________________________________________</w:t>
-      </w:r>
-    </w:p>
-    <w:p>
-      <w:pPr>
-        <w:ind w:left="720"/>
-        <w:rPr>
-          <w:rFonts w:ascii="Arial" w:hAnsi="Arial" w:cs="Arial"/>
-          <w:sz w:val="22"/>
-          <w:szCs w:val="22"/>
-        </w:rPr>
-      </w:pPr>
-      <w:r>
-        <w:rPr>
-          <w:rFonts w:ascii="Arial" w:hAnsi="Arial" w:cs="Arial"/>
-          <w:sz w:val="22"/>
-          <w:szCs w:val="22"/>
-        </w:rPr>
-        <w:t>{%p endif %}</w:t>
-      </w:r>
-    </w:p>
-    <w:p>
-      <w:pPr>
-        <w:ind w:left="720"/>
-        <w:rPr>
-          <w:rFonts w:ascii="Arial" w:hAnsi="Arial" w:cs="Arial"/>
-          <w:sz w:val="22"/>
-          <w:szCs w:val="22"/>
-        </w:rPr>
-      </w:pPr>
-      <w:r>
-        <w:rPr>
-          <w:rFonts w:ascii="Arial" w:hAnsi="Arial" w:cs="Arial"/>
-          <w:sz w:val="22"/>
-          <w:szCs w:val="22"/>
-        </w:rPr>
-        <w:t xml:space="preserve">{%p if </w:t>
-      </w:r>
-      <w:proofErr w:type="spellStart"/>
-      <w:r>
-        <w:rPr>
-          <w:rFonts w:ascii="Arial" w:hAnsi="Arial" w:cs="Arial"/>
-          <w:sz w:val="22"/>
-          <w:szCs w:val="22"/>
-        </w:rPr>
-        <w:t>action.court_state</w:t>
-      </w:r>
-      <w:proofErr w:type="spellEnd"/>
-      <w:r>
-        <w:rPr>
-          <w:rFonts w:ascii="Arial" w:hAnsi="Arial" w:cs="Arial"/>
-          <w:sz w:val="22"/>
-          <w:szCs w:val="22"/>
-        </w:rPr>
-        <w:t xml:space="preserve"> %}</w:t>
-      </w:r>
-    </w:p>
-    <w:p>
-      <w:pPr>
-        <w:ind w:left="720"/>
-        <w:rPr>
-          <w:rFonts w:ascii="Arial" w:hAnsi="Arial" w:cs="Arial"/>
-          <w:sz w:val="22"/>
-          <w:szCs w:val="22"/>
-        </w:rPr>
-      </w:pPr>
-      <w:r>
-        <w:rPr>
-          <w:rFonts w:ascii="Arial" w:hAnsi="Arial" w:cs="Arial"/>
-          <w:sz w:val="22"/>
-          <w:szCs w:val="22"/>
-        </w:rPr>
-        <w:t xml:space="preserve">State: {{ </w:t>
-      </w:r>
-      <w:proofErr w:type="spellStart"/>
-      <w:r>
-        <w:rPr>
-          <w:rFonts w:ascii="Arial" w:hAnsi="Arial" w:cs="Arial"/>
-          <w:sz w:val="22"/>
-          <w:szCs w:val="22"/>
-        </w:rPr>
-        <w:t>action.court_state</w:t>
-      </w:r>
-      <w:proofErr w:type="spellEnd"/>
-      <w:r>
-        <w:rPr>
-          <w:rFonts w:ascii="Arial" w:hAnsi="Arial" w:cs="Arial"/>
-          <w:sz w:val="22"/>
-          <w:szCs w:val="22"/>
-        </w:rPr>
-        <w:t xml:space="preserve"> }}</w:t>
-      </w:r>
-    </w:p>
-    <w:p>
-      <w:pPr>
-        <w:ind w:left="720"/>
-        <w:rPr>
-          <w:rFonts w:ascii="Arial" w:hAnsi="Arial" w:cs="Arial"/>
-          <w:sz w:val="22"/>
-          <w:szCs w:val="22"/>
-        </w:rPr>
-      </w:pPr>
-      <w:r>
-        <w:rPr>
-          <w:rFonts w:ascii="Arial" w:hAnsi="Arial" w:cs="Arial"/>
-          <w:sz w:val="22"/>
-          <w:szCs w:val="22"/>
-        </w:rPr>
-        <w:t>{%p else %}</w:t>
-      </w:r>
-    </w:p>
-    <w:p>
-      <w:pPr>
-        <w:ind w:left="720"/>
-        <w:rPr>
-          <w:rFonts w:ascii="Arial" w:hAnsi="Arial" w:cs="Arial"/>
-          <w:sz w:val="22"/>
-          <w:szCs w:val="22"/>
-        </w:rPr>
-      </w:pPr>
-      <w:r>
-        <w:rPr>
-          <w:rFonts w:ascii="Arial" w:hAnsi="Arial" w:cs="Arial"/>
-          <w:sz w:val="22"/>
-          <w:szCs w:val="22"/>
-        </w:rPr>
-        <w:t>State:____________________________________________________________</w:t>
-      </w:r>
-    </w:p>
-    <w:p>
-      <w:pPr>
-        <w:ind w:left="720"/>
-        <w:rPr>
-          <w:rFonts w:ascii="Arial" w:hAnsi="Arial" w:cs="Arial"/>
-          <w:sz w:val="22"/>
-          <w:szCs w:val="22"/>
-        </w:rPr>
-      </w:pPr>
-      <w:r>
-        <w:rPr>
-          <w:rFonts w:ascii="Arial" w:hAnsi="Arial" w:cs="Arial"/>
-          <w:sz w:val="22"/>
-          <w:szCs w:val="22"/>
-        </w:rPr>
-        <w:t>{%p endif %}</w:t>
-      </w:r>
-    </w:p>
-    <w:p>
-      <w:pPr>
-        <w:ind w:left="720"/>
-        <w:rPr>
-          <w:rFonts w:ascii="Arial" w:hAnsi="Arial" w:cs="Arial"/>
-          <w:sz w:val="22"/>
-          <w:szCs w:val="22"/>
-        </w:rPr>
-      </w:pPr>
-      <w:r>
-        <w:rPr>
-          <w:rFonts w:ascii="Arial" w:hAnsi="Arial" w:cs="Arial"/>
-          <w:sz w:val="22"/>
-          <w:szCs w:val="22"/>
-        </w:rPr>
-        <w:t>{%p if action.judge %}</w:t>
-      </w:r>
-    </w:p>
-    <w:p>
-      <w:pPr>
-        <w:ind w:left="720"/>
-        <w:rPr>
-          <w:rFonts w:ascii="Arial" w:hAnsi="Arial" w:cs="Arial"/>
-          <w:sz w:val="22"/>
-          <w:szCs w:val="22"/>
-        </w:rPr>
-      </w:pPr>
-      <w:r>
-        <w:rPr>
-          <w:rFonts w:ascii="Arial" w:hAnsi="Arial" w:cs="Arial"/>
-          <w:sz w:val="22"/>
-          <w:szCs w:val="22"/>
-        </w:rPr>
-        <w:t>Name of judge: {{ action.judge }}</w:t>
-      </w:r>
-    </w:p>
-    <w:p>
-      <w:pPr>
-        <w:ind w:left="720"/>
-        <w:rPr>
-          <w:rFonts w:ascii="Arial" w:hAnsi="Arial" w:cs="Arial"/>
-          <w:sz w:val="22"/>
-          <w:szCs w:val="22"/>
-        </w:rPr>
-      </w:pPr>
-      <w:r>
-        <w:rPr>
-          <w:rFonts w:ascii="Arial" w:hAnsi="Arial" w:cs="Arial"/>
-          <w:sz w:val="22"/>
-          <w:szCs w:val="22"/>
-        </w:rPr>
-        <w:t>{%p else %}</w:t>
-      </w:r>
-    </w:p>
-    <w:p>
-      <w:pPr>
-        <w:ind w:left="720"/>
-        <w:rPr>
-          <w:rFonts w:ascii="Arial" w:hAnsi="Arial" w:cs="Arial"/>
-          <w:sz w:val="22"/>
-          <w:szCs w:val="22"/>
-        </w:rPr>
-      </w:pPr>
-      <w:r>
-        <w:rPr>
-          <w:rFonts w:ascii="Arial" w:hAnsi="Arial" w:cs="Arial"/>
-          <w:sz w:val="22"/>
-          <w:szCs w:val="22"/>
-        </w:rPr>
-        <w:t>Name of judge:____________________________________________________</w:t>
-      </w:r>
-    </w:p>
-    <w:p>
-      <w:pPr>
-        <w:ind w:left="720"/>
-        <w:rPr>
-          <w:rFonts w:ascii="Arial" w:hAnsi="Arial" w:cs="Arial"/>
-          <w:sz w:val="22"/>
-          <w:szCs w:val="22"/>
-        </w:rPr>
-      </w:pPr>
-      <w:r>
-        <w:rPr>
-          <w:rFonts w:ascii="Arial" w:hAnsi="Arial" w:cs="Arial"/>
-          <w:sz w:val="22"/>
-          <w:szCs w:val="22"/>
-        </w:rPr>
-        <w:t>{%p endif %}</w:t>
-      </w:r>
-    </w:p>
-    <w:p>
-      <w:pPr>
-        <w:ind w:left="720"/>
-        <w:rPr>
-          <w:rFonts w:ascii="Arial" w:hAnsi="Arial" w:cs="Arial"/>
-          <w:sz w:val="22"/>
-          <w:szCs w:val="22"/>
-        </w:rPr>
-      </w:pPr>
-      <w:r>
-        <w:rPr>
-          <w:rFonts w:ascii="Arial" w:hAnsi="Arial" w:cs="Arial"/>
-          <w:sz w:val="22"/>
-          <w:szCs w:val="22"/>
-        </w:rPr>
-        <w:t>{%p endfor %}</w:t>
-      </w:r>
-    </w:p>
-    <w:p>
-      <w:pPr>
-        <w:ind w:left="720"/>
-        <w:rPr>
-          <w:rFonts w:ascii="Arial" w:hAnsi="Arial" w:cs="Arial"/>
-          <w:sz w:val="22"/>
-          <w:szCs w:val="22"/>
-        </w:rPr>
-      </w:pPr>
-    </w:p>
-    <w:p>
-      <w:pPr>
-        <w:rPr>
-          <w:rFonts w:ascii="Arial" w:hAnsi="Arial" w:cs="Arial"/>
-          <w:sz w:val="22"/>
-          <w:szCs w:val="22"/>
-        </w:rPr>
-      </w:pPr>
-      <w:r>
-        <w:rPr>
-          <w:rFonts w:ascii="Arial" w:hAnsi="Arial" w:cs="Arial"/>
-          <w:sz w:val="22"/>
-          <w:szCs w:val="22"/>
-        </w:rPr>
-        <w:t>{%p endif %}</w:t>
-      </w:r>
-    </w:p>
-    <w:p>
-      <w:pPr>
-        <w:rPr>
-          <w:rFonts w:ascii="Arial" w:hAnsi="Arial" w:cs="Arial"/>
-          <w:sz w:val="22"/>
-          <w:szCs w:val="22"/>
-        </w:rPr>
-      </w:pPr>
-      <w:r>
-        <w:rPr>
-          <w:rFonts w:ascii="Arial" w:hAnsi="Arial" w:cs="Arial"/>
-          <w:sz w:val="22"/>
-          <w:szCs w:val="22"/>
-        </w:rPr>
-        <w:t xml:space="preserve">{%p if </w:t>
-      </w:r>
-      <w:r>
-        <w:rPr>
-          <w:rFonts w:ascii="Arial" w:hAnsi="Arial" w:cs="Arial"/>
-          <w:sz w:val="22"/>
-          <w:szCs w:val="22"/>
-        </w:rPr>
-        <w:t>orders_judgments_re_parties_yes</w:t>
-      </w:r>
-      <w:r>
-        <w:rPr>
-          <w:rFonts w:ascii="Arial" w:hAnsi="Arial" w:cs="Arial"/>
-          <w:sz w:val="22"/>
-          <w:szCs w:val="22"/>
-        </w:rPr>
-        <w:t xml:space="preserve"> %}</w:t>
-      </w:r>
-    </w:p>
-    <w:p>
-      <w:pPr>
-        <w:rPr>
-          <w:rFonts w:ascii="Arial" w:hAnsi="Arial" w:cs="Arial"/>
-          <w:sz w:val="22"/>
-          <w:szCs w:val="22"/>
-        </w:rPr>
-      </w:pPr>
-      <w:r>
-        <w:rPr>
-          <w:rFonts w:ascii="Arial" w:hAnsi="Arial" w:cs="Arial"/>
-          <w:sz w:val="22"/>
-          <w:szCs w:val="22"/>
-        </w:rPr>
-        <w:t xml:space="preserve">Orders and Judgments, continued from </w:t>
-      </w:r>
-      <w:r>
-        <w:rPr>
-          <w:rFonts w:ascii="Arial" w:hAnsi="Arial" w:cs="Arial"/>
-          <w:color w:val="000000"/>
-          <w:sz w:val="22"/>
-          <w:szCs w:val="22"/>
-        </w:rPr>
-        <w:t>{% if respondent_is_minor and (not respondent_is_emancipated_minor) %}E4b{% else %}</w:t>
-      </w:r>
-      <w:r>
-        <w:rPr>
-          <w:rFonts w:ascii="Arial" w:hAnsi="Arial" w:cs="Arial"/>
-          <w:sz w:val="22"/>
-          <w:szCs w:val="22"/>
-        </w:rPr>
-        <w:t>D</w:t>
-      </w:r>
-      <w:r>
-        <w:rPr>
-          <w:rFonts w:ascii="Arial" w:hAnsi="Arial" w:cs="Arial"/>
-          <w:sz w:val="22"/>
-          <w:szCs w:val="22"/>
-        </w:rPr>
-        <w:t>3b</w:t>
-      </w:r>
-      <w:r>
-        <w:rPr>
-          <w:rFonts w:ascii="Arial" w:hAnsi="Arial" w:cs="Arial"/>
-          <w:sz w:val="22"/>
-          <w:szCs w:val="22"/>
-        </w:rPr>
-        <w:t>{% endif %}</w:t>
-      </w:r>
-    </w:p>
-    <w:p>
-      <w:pPr>
-        <w:rPr>
-          <w:rFonts w:ascii="Arial" w:hAnsi="Arial" w:cs="Arial"/>
-          <w:sz w:val="22"/>
-          <w:szCs w:val="22"/>
-        </w:rPr>
-      </w:pPr>
-      <w:r>
-        <w:rPr>
-          <w:rFonts w:ascii="Arial" w:hAnsi="Arial" w:cs="Arial"/>
-          <w:sz w:val="22"/>
-          <w:szCs w:val="22"/>
-        </w:rPr>
-        <w:tab/>
-        <w:t>{%p for order in orders_judgments %}</w:t>
-      </w:r>
-    </w:p>
-    <w:p>
-      <w:pPr>
-        <w:rPr>
-          <w:rFonts w:ascii="Arial" w:hAnsi="Arial" w:cs="Arial"/>
-          <w:sz w:val="22"/>
-          <w:szCs w:val="22"/>
-        </w:rPr>
-      </w:pPr>
-    </w:p>
-    <w:p>
-      <w:pPr>
-        <w:rPr>
-          <w:rFonts w:ascii="Arial" w:hAnsi="Arial" w:cs="Arial"/>
-          <w:sz w:val="22"/>
-          <w:szCs w:val="22"/>
-        </w:rPr>
-      </w:pPr>
-      <w:r>
-        <w:rPr>
-          <w:rFonts w:ascii="Arial" w:hAnsi="Arial" w:cs="Arial"/>
-          <w:sz w:val="22"/>
-          <w:szCs w:val="22"/>
-        </w:rPr>
-        <w:tab/>
-        <w:t>Case number: {{ order.docket_number }}</w:t>
-      </w:r>
-    </w:p>
-    <w:p>
-      <w:pPr>
-        <w:rPr>
-          <w:rFonts w:ascii="Arial" w:hAnsi="Arial" w:cs="Arial"/>
-          <w:sz w:val="22"/>
-          <w:szCs w:val="22"/>
-        </w:rPr>
-      </w:pPr>
-      <w:r>
-        <w:rPr>
-          <w:rFonts w:ascii="Arial" w:hAnsi="Arial" w:cs="Arial"/>
-          <w:sz w:val="22"/>
-          <w:szCs w:val="22"/>
-        </w:rPr>
-        <w:tab/>
-        <w:t>{%p if order.court_name %}</w:t>
-      </w:r>
-    </w:p>
-    <w:p>
-      <w:pPr>
-        <w:ind w:left="720"/>
-        <w:rPr>
-          <w:rFonts w:ascii="Arial" w:hAnsi="Arial" w:cs="Arial"/>
-          <w:sz w:val="22"/>
-          <w:szCs w:val="22"/>
-        </w:rPr>
-      </w:pPr>
-      <w:r>
-        <w:rPr>
-          <w:rFonts w:ascii="Arial" w:hAnsi="Arial" w:cs="Arial"/>
-          <w:sz w:val="22"/>
-          <w:szCs w:val="22"/>
-        </w:rPr>
-        <w:t>Name of court: {{ order.court_name }}</w:t>
-      </w:r>
-    </w:p>
-    <w:p>
-      <w:pPr>
-        <w:ind w:left="720"/>
-        <w:rPr>
-          <w:rFonts w:ascii="Arial" w:hAnsi="Arial" w:cs="Arial"/>
-          <w:sz w:val="22"/>
-          <w:szCs w:val="22"/>
-        </w:rPr>
-      </w:pPr>
-      <w:r>
-        <w:rPr>
-          <w:rFonts w:ascii="Arial" w:hAnsi="Arial" w:cs="Arial"/>
-          <w:sz w:val="22"/>
-          <w:szCs w:val="22"/>
-        </w:rPr>
-        <w:t>{%p else %}</w:t>
-      </w:r>
-    </w:p>
-    <w:p>
-      <w:pPr>
-        <w:ind w:left="720"/>
-        <w:rPr>
-          <w:rFonts w:ascii="Arial" w:hAnsi="Arial" w:cs="Arial"/>
-          <w:sz w:val="22"/>
-          <w:szCs w:val="22"/>
-        </w:rPr>
-      </w:pPr>
-      <w:r>
-        <w:rPr>
-          <w:rFonts w:ascii="Arial" w:hAnsi="Arial" w:cs="Arial"/>
-          <w:sz w:val="22"/>
-          <w:szCs w:val="22"/>
-        </w:rPr>
-        <w:t>Name of court:____________________________________________________</w:t>
-      </w:r>
-    </w:p>
-    <w:p>
-      <w:pPr>
-        <w:ind w:left="720"/>
-        <w:rPr>
-          <w:rFonts w:ascii="Arial" w:hAnsi="Arial" w:cs="Arial"/>
-          <w:sz w:val="22"/>
-          <w:szCs w:val="22"/>
-        </w:rPr>
-      </w:pPr>
-      <w:r>
-        <w:rPr>
-          <w:rFonts w:ascii="Arial" w:hAnsi="Arial" w:cs="Arial"/>
-          <w:sz w:val="22"/>
-          <w:szCs w:val="22"/>
-        </w:rPr>
-        <w:t>{%p endif %}</w:t>
-      </w:r>
-    </w:p>
-    <w:p>
-      <w:pPr>
-        <w:ind w:left="720"/>
-        <w:rPr>
-          <w:rFonts w:ascii="Arial" w:hAnsi="Arial" w:cs="Arial"/>
-          <w:sz w:val="22"/>
-          <w:szCs w:val="22"/>
-        </w:rPr>
-      </w:pPr>
-      <w:r>
-        <w:rPr>
-          <w:rFonts w:ascii="Arial" w:hAnsi="Arial" w:cs="Arial"/>
-          <w:sz w:val="22"/>
-          <w:szCs w:val="22"/>
-        </w:rPr>
-        <w:t>{%p if order.court_county %}</w:t>
-      </w:r>
-    </w:p>
-    <w:p>
-      <w:pPr>
-        <w:ind w:left="720"/>
-        <w:rPr>
-          <w:rFonts w:ascii="Arial" w:hAnsi="Arial" w:cs="Arial"/>
-          <w:sz w:val="22"/>
-          <w:szCs w:val="22"/>
-        </w:rPr>
-      </w:pPr>
-      <w:r>
-        <w:rPr>
-          <w:rFonts w:ascii="Arial" w:hAnsi="Arial" w:cs="Arial"/>
-          <w:sz w:val="22"/>
-          <w:szCs w:val="22"/>
-        </w:rPr>
-        <w:t>County: {{ order.court_county }}</w:t>
-      </w:r>
-    </w:p>
-    <w:p>
-      <w:pPr>
-        <w:ind w:left="720"/>
-        <w:rPr>
-          <w:rFonts w:ascii="Arial" w:hAnsi="Arial" w:cs="Arial"/>
-          <w:sz w:val="22"/>
-          <w:szCs w:val="22"/>
-        </w:rPr>
-      </w:pPr>
-      <w:r>
-        <w:rPr>
-          <w:rFonts w:ascii="Arial" w:hAnsi="Arial" w:cs="Arial"/>
-          <w:sz w:val="22"/>
-          <w:szCs w:val="22"/>
-        </w:rPr>
-        <w:t>{%p else %}</w:t>
-      </w:r>
-    </w:p>
-    <w:p>
-      <w:pPr>
-        <w:ind w:left="720"/>
-        <w:rPr>
-          <w:rFonts w:ascii="Arial" w:hAnsi="Arial" w:cs="Arial"/>
-          <w:sz w:val="22"/>
-          <w:szCs w:val="22"/>
-        </w:rPr>
-      </w:pPr>
-      <w:r>
-        <w:rPr>
-          <w:rFonts w:ascii="Arial" w:hAnsi="Arial" w:cs="Arial"/>
-          <w:sz w:val="22"/>
-          <w:szCs w:val="22"/>
-        </w:rPr>
-        <w:t>County:__________________________________________________________</w:t>
-      </w:r>
-    </w:p>
-    <w:p>
-      <w:pPr>
-        <w:ind w:left="720"/>
-        <w:rPr>
-          <w:rFonts w:ascii="Arial" w:hAnsi="Arial" w:cs="Arial"/>
-          <w:sz w:val="22"/>
-          <w:szCs w:val="22"/>
-        </w:rPr>
-      </w:pPr>
-      <w:r>
-        <w:rPr>
-          <w:rFonts w:ascii="Arial" w:hAnsi="Arial" w:cs="Arial"/>
-          <w:sz w:val="22"/>
-          <w:szCs w:val="22"/>
-        </w:rPr>
-        <w:t>{%p endif %}</w:t>
-      </w:r>
-    </w:p>
-    <w:p>
-      <w:pPr>
-        <w:ind w:left="720"/>
-        <w:rPr>
-          <w:rFonts w:ascii="Arial" w:hAnsi="Arial" w:cs="Arial"/>
-          <w:sz w:val="22"/>
-          <w:szCs w:val="22"/>
-        </w:rPr>
-      </w:pPr>
-      <w:r>
-        <w:rPr>
-          <w:rFonts w:ascii="Arial" w:hAnsi="Arial" w:cs="Arial"/>
-          <w:sz w:val="22"/>
-          <w:szCs w:val="22"/>
-        </w:rPr>
-        <w:lastRenderedPageBreak/>
-        <w:t>{%p if order.court_state %}</w:t>
-      </w:r>
-    </w:p>
-    <w:p>
-      <w:pPr>
-        <w:ind w:left="720"/>
-        <w:rPr>
-          <w:rFonts w:ascii="Arial" w:hAnsi="Arial" w:cs="Arial"/>
-          <w:sz w:val="22"/>
-          <w:szCs w:val="22"/>
-        </w:rPr>
-      </w:pPr>
-      <w:r>
-        <w:rPr>
-          <w:rFonts w:ascii="Arial" w:hAnsi="Arial" w:cs="Arial"/>
-          <w:sz w:val="22"/>
-          <w:szCs w:val="22"/>
-        </w:rPr>
-        <w:t>State: {{ order.court_state }}</w:t>
-      </w:r>
-    </w:p>
-    <w:p>
-      <w:pPr>
-        <w:ind w:left="720"/>
-        <w:rPr>
-          <w:rFonts w:ascii="Arial" w:hAnsi="Arial" w:cs="Arial"/>
-          <w:sz w:val="22"/>
-          <w:szCs w:val="22"/>
-        </w:rPr>
-      </w:pPr>
-      <w:r>
-        <w:rPr>
-          <w:rFonts w:ascii="Arial" w:hAnsi="Arial" w:cs="Arial"/>
-          <w:sz w:val="22"/>
-          <w:szCs w:val="22"/>
-        </w:rPr>
-        <w:t>{%p else %}</w:t>
-      </w:r>
-    </w:p>
-    <w:p>
-      <w:pPr>
-        <w:ind w:left="720"/>
-        <w:rPr>
-          <w:rFonts w:ascii="Arial" w:hAnsi="Arial" w:cs="Arial"/>
-          <w:sz w:val="22"/>
-          <w:szCs w:val="22"/>
-        </w:rPr>
-      </w:pPr>
-      <w:r>
-        <w:rPr>
-          <w:rFonts w:ascii="Arial" w:hAnsi="Arial" w:cs="Arial"/>
-          <w:sz w:val="22"/>
-          <w:szCs w:val="22"/>
-        </w:rPr>
-        <w:t>State:____________________________________________________________</w:t>
-      </w:r>
-    </w:p>
-    <w:p>
-      <w:pPr>
-        <w:ind w:left="720"/>
-        <w:rPr>
-          <w:rFonts w:ascii="Arial" w:hAnsi="Arial" w:cs="Arial"/>
-          <w:sz w:val="22"/>
-          <w:szCs w:val="22"/>
-        </w:rPr>
-      </w:pPr>
-      <w:r>
-        <w:rPr>
-          <w:rFonts w:ascii="Arial" w:hAnsi="Arial" w:cs="Arial"/>
-          <w:sz w:val="22"/>
-          <w:szCs w:val="22"/>
-        </w:rPr>
-        <w:t>{%p endif %}</w:t>
-      </w:r>
-    </w:p>
-    <w:p>
-      <w:pPr>
-        <w:ind w:left="720"/>
-        <w:rPr>
-          <w:rFonts w:ascii="Arial" w:hAnsi="Arial" w:cs="Arial"/>
-          <w:sz w:val="22"/>
-          <w:szCs w:val="22"/>
-        </w:rPr>
-      </w:pPr>
-      <w:r>
-        <w:rPr>
-          <w:rFonts w:ascii="Arial" w:hAnsi="Arial" w:cs="Arial"/>
-          <w:sz w:val="22"/>
-          <w:szCs w:val="22"/>
-        </w:rPr>
-        <w:t>{%p if order.judge %}</w:t>
-      </w:r>
-    </w:p>
-    <w:p>
-      <w:pPr>
-        <w:ind w:left="720"/>
-        <w:rPr>
-          <w:rFonts w:ascii="Arial" w:hAnsi="Arial" w:cs="Arial"/>
-          <w:sz w:val="22"/>
-          <w:szCs w:val="22"/>
-        </w:rPr>
-      </w:pPr>
-      <w:r>
-        <w:rPr>
-          <w:rFonts w:ascii="Arial" w:hAnsi="Arial" w:cs="Arial"/>
-          <w:sz w:val="22"/>
-          <w:szCs w:val="22"/>
-        </w:rPr>
-        <w:t>Name of judge: {{ order.judge }}</w:t>
-      </w:r>
-    </w:p>
-    <w:p>
-      <w:pPr>
-        <w:ind w:left="720"/>
-        <w:rPr>
-          <w:rFonts w:ascii="Arial" w:hAnsi="Arial" w:cs="Arial"/>
-          <w:sz w:val="22"/>
-          <w:szCs w:val="22"/>
-        </w:rPr>
-      </w:pPr>
-      <w:r>
-        <w:rPr>
-          <w:rFonts w:ascii="Arial" w:hAnsi="Arial" w:cs="Arial"/>
-          <w:sz w:val="22"/>
-          <w:szCs w:val="22"/>
-        </w:rPr>
-        <w:t>{%p else %}</w:t>
-      </w:r>
-    </w:p>
-    <w:p>
-      <w:pPr>
-        <w:ind w:left="720"/>
-        <w:rPr>
-          <w:rFonts w:ascii="Arial" w:hAnsi="Arial" w:cs="Arial"/>
-          <w:sz w:val="22"/>
-          <w:szCs w:val="22"/>
-        </w:rPr>
-      </w:pPr>
-      <w:r>
-        <w:rPr>
-          <w:rFonts w:ascii="Arial" w:hAnsi="Arial" w:cs="Arial"/>
-          <w:sz w:val="22"/>
-          <w:szCs w:val="22"/>
-        </w:rPr>
-        <w:t>Name of judge:____________________________________________________</w:t>
-      </w:r>
-    </w:p>
-    <w:p>
-      <w:pPr>
-        <w:ind w:left="720"/>
-        <w:rPr>
-          <w:rFonts w:ascii="Arial" w:hAnsi="Arial" w:cs="Arial"/>
-          <w:sz w:val="22"/>
-          <w:szCs w:val="22"/>
-        </w:rPr>
-      </w:pPr>
-      <w:r>
-        <w:rPr>
-          <w:rFonts w:ascii="Arial" w:hAnsi="Arial" w:cs="Arial"/>
-          <w:sz w:val="22"/>
-          <w:szCs w:val="22"/>
-        </w:rPr>
-        <w:t>{%p endif %}</w:t>
-      </w:r>
-    </w:p>
-    <w:p>
-      <w:pPr>
-        <w:ind w:left="720"/>
-        <w:rPr>
-          <w:rFonts w:ascii="Arial" w:hAnsi="Arial" w:cs="Arial"/>
-          <w:sz w:val="22"/>
-          <w:szCs w:val="22"/>
-        </w:rPr>
-      </w:pPr>
-      <w:r>
-        <w:rPr>
-          <w:rFonts w:ascii="Arial" w:hAnsi="Arial" w:cs="Arial"/>
-          <w:sz w:val="22"/>
-          <w:szCs w:val="22"/>
-        </w:rPr>
-        <w:t>{%p endfor %}</w:t>
-      </w:r>
-    </w:p>
-    <w:p>
-      <w:pPr>
-        <w:ind w:left="720"/>
-        <w:rPr>
-          <w:rFonts w:ascii="Arial" w:hAnsi="Arial" w:cs="Arial"/>
-          <w:sz w:val="22"/>
-          <w:szCs w:val="22"/>
-        </w:rPr>
-      </w:pPr>
-    </w:p>
-    <w:p>
-      <w:pPr>
-        <w:rPr>
-          <w:rFonts w:ascii="Arial" w:hAnsi="Arial" w:cs="Arial"/>
-          <w:sz w:val="22"/>
-          <w:szCs w:val="22"/>
-        </w:rPr>
-      </w:pPr>
-      <w:r>
-        <w:rPr>
-          <w:rFonts w:ascii="Arial" w:hAnsi="Arial" w:cs="Arial"/>
-          <w:sz w:val="22"/>
-          <w:szCs w:val="22"/>
-        </w:rPr>
-        <w:t>{%p endif %}</w:t>
-      </w:r>
     </w:p>
     <w:p>
       <w:pPr>
@@ -1321,7 +191,6 @@
           <w:szCs w:val="22"/>
         </w:rPr>
       </w:pPr>
-      <w:proofErr w:type="gramStart"/>
       <w:r>
         <w:rPr>
           <w:rFonts w:ascii="Arial" w:hAnsi="Arial" w:cs="Arial"/>
@@ -1336,42 +205,15 @@
           <w:sz w:val="22"/>
           <w:szCs w:val="22"/>
         </w:rPr>
-        <w:t>item</w:t>
-      </w:r>
-      <w:proofErr w:type="gramEnd"/>
-      <w:r>
-        <w:rPr>
-          <w:rFonts w:ascii="Arial" w:hAnsi="Arial" w:cs="Arial"/>
-          <w:sz w:val="22"/>
-          <w:szCs w:val="22"/>
-        </w:rPr>
-        <w:t>.on_one_</w:t>
-      </w:r>
-      <w:proofErr w:type="gramStart"/>
-      <w:r>
-        <w:rPr>
-          <w:rFonts w:ascii="Arial" w:hAnsi="Arial" w:cs="Arial"/>
-          <w:sz w:val="22"/>
-          <w:szCs w:val="22"/>
-        </w:rPr>
-        <w:t>line()</w:t>
-      </w:r>
-      <w:r>
-        <w:rPr>
-          <w:rFonts w:ascii="Arial" w:hAnsi="Arial" w:cs="Arial"/>
-          <w:sz w:val="22"/>
-          <w:szCs w:val="22"/>
-        </w:rPr>
-        <w:t xml:space="preserve"> }</w:t>
-      </w:r>
-      <w:proofErr w:type="gramEnd"/>
-      <w:r>
-        <w:rPr>
-          <w:rFonts w:ascii="Arial" w:hAnsi="Arial" w:cs="Arial"/>
-          <w:sz w:val="22"/>
-          <w:szCs w:val="22"/>
-        </w:rPr>
-        <w:t>}</w:t>
+        <w:t>item.on_one_line()</w:t>
+      </w:r>
+      <w:r>
+        <w:rPr>
+          <w:rFonts w:ascii="Arial" w:hAnsi="Arial" w:cs="Arial"/>
+          <w:sz w:val="22"/>
+          <w:szCs w:val="22"/>
+        </w:rPr>
+        <w:t xml:space="preserve"> }}</w:t>
       </w:r>
     </w:p>
     <w:p>
@@ -1389,18 +231,8 @@
           <w:sz w:val="22"/>
           <w:szCs w:val="22"/>
         </w:rPr>
-        <w:t xml:space="preserve">{%p </w:t>
-      </w:r>
-      <w:proofErr w:type="gramStart"/>
-      <w:r>
-        <w:rPr>
-          <w:rFonts w:ascii="Arial" w:hAnsi="Arial" w:cs="Arial"/>
-          <w:sz w:val="22"/>
-          <w:szCs w:val="22"/>
-        </w:rPr>
-        <w:t>endfor %}</w:t>
-      </w:r>
-      <w:proofErr w:type="gramEnd"/>
+        <w:t>{%p endfor %}</w:t>
+      </w:r>
     </w:p>
     <w:p>
       <w:pPr>
@@ -1426,18 +258,8 @@
           <w:sz w:val="22"/>
           <w:szCs w:val="22"/>
         </w:rPr>
-        <w:t xml:space="preserve">{%p </w:t>
-      </w:r>
-      <w:proofErr w:type="gramStart"/>
-      <w:r>
-        <w:rPr>
-          <w:rFonts w:ascii="Arial" w:hAnsi="Arial" w:cs="Arial"/>
-          <w:sz w:val="22"/>
-          <w:szCs w:val="22"/>
-        </w:rPr>
-        <w:t>endif %}</w:t>
-      </w:r>
-      <w:proofErr w:type="gramEnd"/>
+        <w:t>{%p endif %}</w:t>
+      </w:r>
     </w:p>
     <w:p>
       <w:pPr>

</xml_diff>